<commit_message>
v1.12.10: Researcher user guide: rewrite Work Offline section for the downloadable-package + upload-to-sync model, curator review queue, attachments & thumbnails
</commit_message>
<xml_diff>
--- a/docs/researcher-user-guide.docx
+++ b/docs/researcher-user-guide.docx
@@ -7,7 +7,7 @@
         <w:pStyle w:val="Title"/>
       </w:pPr>
       <w:r>
-        <w:t xml:space="preserve">AtoM Heratio Research Portal — Training Manual v3.3.0</w:t>
+        <w:t xml:space="preserve">Researcher Portal — User Guide</w:t>
       </w:r>
     </w:p>
     <w:p>
@@ -18,7 +18,7 @@
         <w:t xml:space="preserve">The Archive and Heritage Group (Pty) Ltd</w:t>
       </w:r>
     </w:p>
-    <w:bookmarkStart w:id="270" w:name="Xe3e047f7943f81573036ed0a08c2926d90f9c32"/>
+    <w:bookmarkStart w:id="271" w:name="Xe3e047f7943f81573036ed0a08c2926d90f9c32"/>
     <w:p>
       <w:pPr>
         <w:pStyle w:val="Heading1"/>
@@ -955,24 +955,14 @@
         </w:numPr>
         <w:pStyle w:val="Compact"/>
       </w:pPr>
-      <w:hyperlink w:anchor="X81cbda938065155ae96861a3836acbf6bb268a2">
+      <w:hyperlink w:anchor="X681d85bb8580ced18912fbc87e6189fa8eaf801">
         <w:r>
           <w:rPr>
             <w:rStyle w:val="Hyperlink"/>
           </w:rPr>
-          <w:t xml:space="preserve">Offline Mode &amp; Sync</w:t>
+          <w:t xml:space="preserve">Work Offline (offline research packages)</w:t>
         </w:r>
       </w:hyperlink>
-      <w:r>
-        <w:t xml:space="preserve"> </w:t>
-      </w:r>
-      <w:r>
-        <w:rPr>
-          <w:bCs/>
-          <w:b/>
-        </w:rPr>
-        <w:t xml:space="preserve">(NEW v3.3.0)</w:t>
-      </w:r>
     </w:p>
     <w:p>
       <w:r>
@@ -24850,30 +24840,99 @@
     </w:p>
     <w:bookmarkEnd w:id="263"/>
     <w:bookmarkEnd w:id="264"/>
-    <w:bookmarkStart w:id="269" w:name="offline-mode-sync"/>
+    <w:bookmarkStart w:id="270" w:name="work-offline-offline-research-packages"/>
     <w:p>
       <w:pPr>
         <w:pStyle w:val="Heading2"/>
       </w:pPr>
       <w:r>
-        <w:t xml:space="preserve">45. Offline Mode &amp; Sync</w:t>
-      </w:r>
-    </w:p>
-    <w:p>
-      <w:pPr>
-        <w:pStyle w:val="BlockText"/>
-      </w:pPr>
-      <w:r>
-        <w:t xml:space="preserve">Available from v3.3.0. Works hand-in-hand with the Mobile Shell (§44).</w:t>
-      </w:r>
-    </w:p>
-    <w:bookmarkStart w:id="265" w:name="whats-available-offline"/>
+        <w:t xml:space="preserve">45. Work Offline (offline research packages)</w:t>
+      </w:r>
+    </w:p>
+    <w:p>
+      <w:pPr>
+        <w:pStyle w:val="FirstParagraph"/>
+      </w:pPr>
+      <w:r>
+        <w:t xml:space="preserve">Take</w:t>
+      </w:r>
+      <w:r>
+        <w:t xml:space="preserve"> </w:t>
+      </w:r>
+      <w:r>
+        <w:rPr>
+          <w:bCs/>
+          <w:b/>
+        </w:rPr>
+        <w:t xml:space="preserve">your own collected records</w:t>
+      </w:r>
+      <w:r>
+        <w:t xml:space="preserve"> </w:t>
+      </w:r>
+      <w:r>
+        <w:t xml:space="preserve">offline as a self-contained package, keep</w:t>
+      </w:r>
+      <w:r>
+        <w:t xml:space="preserve"> </w:t>
+      </w:r>
+      <w:r>
+        <w:t xml:space="preserve">researching with</w:t>
+      </w:r>
+      <w:r>
+        <w:t xml:space="preserve"> </w:t>
+      </w:r>
+      <w:r>
+        <w:rPr>
+          <w:bCs/>
+          <w:b/>
+        </w:rPr>
+        <w:t xml:space="preserve">no internet</w:t>
+      </w:r>
+      <w:r>
+        <w:t xml:space="preserve"> </w:t>
+      </w:r>
+      <w:r>
+        <w:t xml:space="preserve">— on a laptop, USB stick or in the field — and then</w:t>
+      </w:r>
+      <w:r>
+        <w:t xml:space="preserve"> </w:t>
+      </w:r>
+      <w:r>
+        <w:t xml:space="preserve">bring your work back. Open it from the research sidebar:</w:t>
+      </w:r>
+      <w:r>
+        <w:t xml:space="preserve"> </w:t>
+      </w:r>
+      <w:r>
+        <w:rPr>
+          <w:bCs/>
+          <w:b/>
+        </w:rPr>
+        <w:t xml:space="preserve">Work Offline</w:t>
+      </w:r>
+      <w:r>
+        <w:t xml:space="preserve"> </w:t>
+      </w:r>
+      <w:r>
+        <w:t xml:space="preserve">(</w:t>
+      </w:r>
+      <w:r>
+        <w:rPr>
+          <w:rStyle w:val="VerbatimChar"/>
+        </w:rPr>
+        <w:t xml:space="preserve">/research/mobile</w:t>
+      </w:r>
+      <w:r>
+        <w:t xml:space="preserve">).</w:t>
+      </w:r>
+    </w:p>
+    <w:bookmarkStart w:id="265" w:name="take-records-offline"/>
     <w:p>
       <w:pPr>
         <w:pStyle w:val="Heading3"/>
       </w:pPr>
       <w:r>
-        <w:t xml:space="preserve">What’s available offline</w:t>
+        <w:t xml:space="preserve">1. Take records offline</w:t>
       </w:r>
     </w:p>
     <w:p>
@@ -24881,7 +24940,23 @@
         <w:pStyle w:val="FirstParagraph"/>
       </w:pPr>
       <w:r>
-        <w:t xml:space="preserve">If you’ve visited the mobile shell at least once, the service worker has cached it. Going offline:</w:t>
+        <w:t xml:space="preserve">On the</w:t>
+      </w:r>
+      <w:r>
+        <w:t xml:space="preserve"> </w:t>
+      </w:r>
+      <w:r>
+        <w:rPr>
+          <w:bCs/>
+          <w:b/>
+        </w:rPr>
+        <w:t xml:space="preserve">Work Offline</w:t>
+      </w:r>
+      <w:r>
+        <w:t xml:space="preserve"> </w:t>
+      </w:r>
+      <w:r>
+        <w:t xml:space="preserve">page, tick which of your own groups to include:</w:t>
       </w:r>
     </w:p>
     <w:p>
@@ -24893,7 +24968,17 @@
         <w:pStyle w:val="Compact"/>
       </w:pPr>
       <w:r>
-        <w:t xml:space="preserve">The mobile home page still loads (from cache)</w:t>
+        <w:rPr>
+          <w:bCs/>
+          <w:b/>
+        </w:rPr>
+        <w:t xml:space="preserve">Collections</w:t>
+      </w:r>
+      <w:r>
+        <w:t xml:space="preserve"> </w:t>
+      </w:r>
+      <w:r>
+        <w:t xml:space="preserve">(evidence sets)</w:t>
       </w:r>
     </w:p>
     <w:p>
@@ -24905,7 +24990,17 @@
         <w:pStyle w:val="Compact"/>
       </w:pPr>
       <w:r>
-        <w:t xml:space="preserve">The 4-button grid is still visible</w:t>
+        <w:rPr>
+          <w:bCs/>
+          <w:b/>
+        </w:rPr>
+        <w:t xml:space="preserve">Projects</w:t>
+      </w:r>
+      <w:r>
+        <w:t xml:space="preserve"> </w:t>
+      </w:r>
+      <w:r>
+        <w:t xml:space="preserve">(their attached records, incl. items added via the project clipboard)</w:t>
       </w:r>
     </w:p>
     <w:p>
@@ -24917,17 +25012,127 @@
         <w:pStyle w:val="Compact"/>
       </w:pPr>
       <w:r>
-        <w:t xml:space="preserve">Other pages may not load until you’re back online</w:t>
+        <w:rPr>
+          <w:bCs/>
+          <w:b/>
+        </w:rPr>
+        <w:t xml:space="preserve">Favourites folders</w:t>
+      </w:r>
+    </w:p>
+    <w:p>
+      <w:pPr>
+        <w:numPr>
+          <w:ilvl w:val="0"/>
+          <w:numId w:val="1035"/>
+        </w:numPr>
+        <w:pStyle w:val="Compact"/>
+      </w:pPr>
+      <w:r>
+        <w:t xml:space="preserve">and, optionally,</w:t>
+      </w:r>
+      <w:r>
+        <w:t xml:space="preserve"> </w:t>
+      </w:r>
+      <w:r>
+        <w:rPr>
+          <w:bCs/>
+          <w:b/>
+        </w:rPr>
+        <w:t xml:space="preserve">your existing notes/annotations</w:t>
+      </w:r>
+      <w:r>
+        <w:t xml:space="preserve"> </w:t>
+      </w:r>
+      <w:r>
+        <w:t xml:space="preserve">on those records</w:t>
+      </w:r>
+    </w:p>
+    <w:p>
+      <w:pPr>
+        <w:pStyle w:val="FirstParagraph"/>
+      </w:pPr>
+      <w:r>
+        <w:t xml:space="preserve">Click</w:t>
+      </w:r>
+      <w:r>
+        <w:t xml:space="preserve"> </w:t>
+      </w:r>
+      <w:r>
+        <w:rPr>
+          <w:bCs/>
+          <w:b/>
+        </w:rPr>
+        <w:t xml:space="preserve">Download offline package</w:t>
+      </w:r>
+      <w:r>
+        <w:t xml:space="preserve">. You get a ZIP that contains a small web viewer</w:t>
+      </w:r>
+      <w:r>
+        <w:t xml:space="preserve"> </w:t>
+      </w:r>
+      <w:r>
+        <w:t xml:space="preserve">(</w:t>
+      </w:r>
+      <w:r>
+        <w:rPr>
+          <w:rStyle w:val="VerbatimChar"/>
+        </w:rPr>
+        <w:t xml:space="preserve">index.html</w:t>
+      </w:r>
+      <w:r>
+        <w:t xml:space="preserve">), the record data, thumbnails, and a</w:t>
+      </w:r>
+      <w:r>
+        <w:t xml:space="preserve"> </w:t>
+      </w:r>
+      <w:r>
+        <w:rPr>
+          <w:rStyle w:val="VerbatimChar"/>
+        </w:rPr>
+        <w:t xml:space="preserve">README.txt</w:t>
+      </w:r>
+      <w:r>
+        <w:t xml:space="preserve">.</w:t>
+      </w:r>
+    </w:p>
+    <w:p>
+      <w:pPr>
+        <w:pStyle w:val="BlockText"/>
+      </w:pPr>
+      <w:r>
+        <w:t xml:space="preserve">Only records you are</w:t>
+      </w:r>
+      <w:r>
+        <w:t xml:space="preserve"> </w:t>
+      </w:r>
+      <w:r>
+        <w:rPr>
+          <w:bCs/>
+          <w:b/>
+        </w:rPr>
+        <w:t xml:space="preserve">permitted to see</w:t>
+      </w:r>
+      <w:r>
+        <w:t xml:space="preserve"> </w:t>
+      </w:r>
+      <w:r>
+        <w:t xml:space="preserve">are ever included — restricted, embargoed</w:t>
+      </w:r>
+      <w:r>
+        <w:t xml:space="preserve"> </w:t>
+      </w:r>
+      <w:r>
+        <w:t xml:space="preserve">or unpublished records are automatically withheld.</w:t>
       </w:r>
     </w:p>
     <w:bookmarkEnd w:id="265"/>
-    <w:bookmarkStart w:id="266" w:name="offline-journal-entries"/>
+    <w:bookmarkStart w:id="266" w:name="work-offline"/>
     <w:p>
       <w:pPr>
         <w:pStyle w:val="Heading3"/>
       </w:pPr>
       <w:r>
-        <w:t xml:space="preserve">Offline journal entries</w:t>
+        <w:t xml:space="preserve">2. Work offline</w:t>
       </w:r>
     </w:p>
     <w:p>
@@ -24935,7 +25140,292 @@
         <w:pStyle w:val="FirstParagraph"/>
       </w:pPr>
       <w:r>
-        <w:t xml:space="preserve">When you submit a quick journal entry while offline, the form:</w:t>
+        <w:t xml:space="preserve">Unzip (or copy the folder to a USB stick) and open</w:t>
+      </w:r>
+      <w:r>
+        <w:t xml:space="preserve"> </w:t>
+      </w:r>
+      <w:r>
+        <w:rPr>
+          <w:rStyle w:val="VerbatimChar"/>
+          <w:bCs/>
+          <w:b/>
+        </w:rPr>
+        <w:t xml:space="preserve">index.html</w:t>
+      </w:r>
+      <w:r>
+        <w:t xml:space="preserve"> </w:t>
+      </w:r>
+      <w:r>
+        <w:t xml:space="preserve">in any web</w:t>
+      </w:r>
+      <w:r>
+        <w:t xml:space="preserve"> </w:t>
+      </w:r>
+      <w:r>
+        <w:t xml:space="preserve">browser — no internet, server or login needed. The left list groups your records</w:t>
+      </w:r>
+      <w:r>
+        <w:t xml:space="preserve"> </w:t>
+      </w:r>
+      <w:r>
+        <w:rPr>
+          <w:bCs/>
+          <w:b/>
+        </w:rPr>
+        <w:t xml:space="preserve">by source</w:t>
+      </w:r>
+      <w:r>
+        <w:t xml:space="preserve"> </w:t>
+      </w:r>
+      <w:r>
+        <w:t xml:space="preserve">(Collections / Projects / Favourites → group name + count). Pick a</w:t>
+      </w:r>
+      <w:r>
+        <w:t xml:space="preserve"> </w:t>
+      </w:r>
+      <w:r>
+        <w:t xml:space="preserve">record to see its details and thumbnail, then add, under</w:t>
+      </w:r>
+      <w:r>
+        <w:t xml:space="preserve"> </w:t>
+      </w:r>
+      <w:r>
+        <w:rPr>
+          <w:bCs/>
+          <w:b/>
+        </w:rPr>
+        <w:t xml:space="preserve">“</w:t>
+      </w:r>
+      <w:r>
+        <w:rPr>
+          <w:bCs/>
+          <w:b/>
+        </w:rPr>
+        <w:t xml:space="preserve">Add offline work</w:t>
+      </w:r>
+      <w:r>
+        <w:rPr>
+          <w:bCs/>
+          <w:b/>
+        </w:rPr>
+        <w:t xml:space="preserve">”</w:t>
+      </w:r>
+      <w:r>
+        <w:t xml:space="preserve">:</w:t>
+      </w:r>
+    </w:p>
+    <w:tbl>
+      <w:tblPr>
+        <w:tblStyle w:val="Table"/>
+        <w:tblW w:type="pct" w:w="5000"/>
+        <w:tblLook w:firstRow="1" w:lastRow="0" w:firstColumn="0" w:lastColumn="0" w:noHBand="0" w:noVBand="0" w:val="0020"/>
+        <w:jc w:val="start"/>
+      </w:tblPr>
+      <w:tblGrid>
+        <w:gridCol w:w="1721"/>
+        <w:gridCol w:w="6198"/>
+      </w:tblGrid>
+      <w:tr>
+        <w:trPr>
+          <w:tblHeader w:val="true"/>
+        </w:trPr>
+        <w:tc>
+          <w:tcPr/>
+          <w:p>
+            <w:pPr>
+              <w:pStyle w:val="Compact"/>
+              <w:jc w:val="left"/>
+            </w:pPr>
+            <w:r>
+              <w:t xml:space="preserve">Tab</w:t>
+            </w:r>
+          </w:p>
+        </w:tc>
+        <w:tc>
+          <w:tcPr/>
+          <w:p>
+            <w:pPr>
+              <w:pStyle w:val="Compact"/>
+              <w:jc w:val="left"/>
+            </w:pPr>
+            <w:r>
+              <w:t xml:space="preserve">What it captures</w:t>
+            </w:r>
+          </w:p>
+        </w:tc>
+      </w:tr>
+      <w:tr>
+        <w:tc>
+          <w:tcPr/>
+          <w:p>
+            <w:pPr>
+              <w:pStyle w:val="Compact"/>
+              <w:jc w:val="left"/>
+            </w:pPr>
+            <w:r>
+              <w:rPr>
+                <w:bCs/>
+                <w:b/>
+              </w:rPr>
+              <w:t xml:space="preserve">Note</w:t>
+            </w:r>
+          </w:p>
+        </w:tc>
+        <w:tc>
+          <w:tcPr/>
+          <w:p>
+            <w:pPr>
+              <w:pStyle w:val="Compact"/>
+              <w:jc w:val="left"/>
+            </w:pPr>
+            <w:r>
+              <w:t xml:space="preserve">A research note on the record</w:t>
+            </w:r>
+          </w:p>
+        </w:tc>
+      </w:tr>
+      <w:tr>
+        <w:tc>
+          <w:tcPr/>
+          <w:p>
+            <w:pPr>
+              <w:pStyle w:val="Compact"/>
+              <w:jc w:val="left"/>
+            </w:pPr>
+            <w:r>
+              <w:rPr>
+                <w:bCs/>
+                <w:b/>
+              </w:rPr>
+              <w:t xml:space="preserve">Source</w:t>
+            </w:r>
+          </w:p>
+        </w:tc>
+        <w:tc>
+          <w:tcPr/>
+          <w:p>
+            <w:pPr>
+              <w:pStyle w:val="Compact"/>
+              <w:jc w:val="left"/>
+            </w:pPr>
+            <w:r>
+              <w:t xml:space="preserve">A reference/citation (title, author, year, URL)</w:t>
+            </w:r>
+          </w:p>
+        </w:tc>
+      </w:tr>
+      <w:tr>
+        <w:tc>
+          <w:tcPr/>
+          <w:p>
+            <w:pPr>
+              <w:pStyle w:val="Compact"/>
+              <w:jc w:val="left"/>
+            </w:pPr>
+            <w:r>
+              <w:rPr>
+                <w:bCs/>
+                <w:b/>
+              </w:rPr>
+              <w:t xml:space="preserve">Suggestion</w:t>
+            </w:r>
+          </w:p>
+        </w:tc>
+        <w:tc>
+          <w:tcPr/>
+          <w:p>
+            <w:pPr>
+              <w:pStyle w:val="Compact"/>
+              <w:jc w:val="left"/>
+            </w:pPr>
+            <w:r>
+              <w:t xml:space="preserve">A proposed metadata correction/addition (curator-reviewed)</w:t>
+            </w:r>
+          </w:p>
+        </w:tc>
+      </w:tr>
+      <w:tr>
+        <w:tc>
+          <w:tcPr/>
+          <w:p>
+            <w:pPr>
+              <w:pStyle w:val="Compact"/>
+              <w:jc w:val="left"/>
+            </w:pPr>
+            <w:r>
+              <w:rPr>
+                <w:bCs/>
+                <w:b/>
+              </w:rPr>
+              <w:t xml:space="preserve">File</w:t>
+            </w:r>
+          </w:p>
+        </w:tc>
+        <w:tc>
+          <w:tcPr/>
+          <w:p>
+            <w:pPr>
+              <w:pStyle w:val="Compact"/>
+              <w:jc w:val="left"/>
+            </w:pPr>
+            <w:r>
+              <w:t xml:space="preserve">A photo/document you attach to the record (max</w:t>
+            </w:r>
+            <w:r>
+              <w:t xml:space="preserve"> </w:t>
+            </w:r>
+            <w:r>
+              <w:rPr>
+                <w:bCs/>
+                <w:b/>
+              </w:rPr>
+              <w:t xml:space="preserve">5 MB</w:t>
+            </w:r>
+            <w:r>
+              <w:t xml:space="preserve"> </w:t>
+            </w:r>
+            <w:r>
+              <w:t xml:space="preserve">each)</w:t>
+            </w:r>
+          </w:p>
+        </w:tc>
+      </w:tr>
+    </w:tbl>
+    <w:p>
+      <w:pPr>
+        <w:pStyle w:val="BodyText"/>
+      </w:pPr>
+      <w:r>
+        <w:t xml:space="preserve">Everything is saved in that browser automatically. A live search box filters within</w:t>
+      </w:r>
+      <w:r>
+        <w:t xml:space="preserve"> </w:t>
+      </w:r>
+      <w:r>
+        <w:t xml:space="preserve">the groups.</w:t>
+      </w:r>
+    </w:p>
+    <w:bookmarkEnd w:id="266"/>
+    <w:bookmarkStart w:id="267" w:name="bring-your-work-back-save-for-sync"/>
+    <w:p>
+      <w:pPr>
+        <w:pStyle w:val="Heading3"/>
+      </w:pPr>
+      <w:r>
+        <w:t xml:space="preserve">3. Bring your work back (</w:t>
+      </w:r>
+      <w:r>
+        <w:t xml:space="preserve">“</w:t>
+      </w:r>
+      <w:r>
+        <w:t xml:space="preserve">Save for sync</w:t>
+      </w:r>
+      <w:r>
+        <w:t xml:space="preserve">”</w:t>
+      </w:r>
+      <w:r>
+        <w:t xml:space="preserve">)</w:t>
       </w:r>
     </w:p>
     <w:p>
@@ -24947,7 +25437,83 @@
         <w:pStyle w:val="Compact"/>
       </w:pPr>
       <w:r>
-        <w:t xml:space="preserve">Stops the normal submit</w:t>
+        <w:t xml:space="preserve">In the package, click</w:t>
+      </w:r>
+      <w:r>
+        <w:t xml:space="preserve"> </w:t>
+      </w:r>
+      <w:r>
+        <w:rPr>
+          <w:bCs/>
+          <w:b/>
+        </w:rPr>
+        <w:t xml:space="preserve">Save for sync</w:t>
+      </w:r>
+      <w:r>
+        <w:t xml:space="preserve"> </w:t>
+      </w:r>
+      <w:r>
+        <w:t xml:space="preserve">→ your browser downloads a</w:t>
+      </w:r>
+      <w:r>
+        <w:t xml:space="preserve"> </w:t>
+      </w:r>
+      <w:r>
+        <w:rPr>
+          <w:rStyle w:val="VerbatimChar"/>
+          <w:bCs/>
+          <w:b/>
+        </w:rPr>
+        <w:t xml:space="preserve">researcher-sync.json</w:t>
+      </w:r>
+      <w:r>
+        <w:t xml:space="preserve"> </w:t>
+      </w:r>
+      <w:r>
+        <w:t xml:space="preserve">file. Any files you attached are</w:t>
+      </w:r>
+      <w:r>
+        <w:t xml:space="preserve"> </w:t>
+      </w:r>
+      <w:r>
+        <w:rPr>
+          <w:bCs/>
+          <w:b/>
+        </w:rPr>
+        <w:t xml:space="preserve">embedded inside this</w:t>
+      </w:r>
+      <w:r>
+        <w:rPr>
+          <w:bCs/>
+          <w:b/>
+        </w:rPr>
+        <w:t xml:space="preserve"> </w:t>
+      </w:r>
+      <w:r>
+        <w:rPr>
+          <w:bCs/>
+          <w:b/>
+        </w:rPr>
+        <w:t xml:space="preserve">JSON</w:t>
+      </w:r>
+      <w:r>
+        <w:t xml:space="preserve">, so it is fully self-contained — you can upload it from any computer; you do</w:t>
+      </w:r>
+      <w:r>
+        <w:t xml:space="preserve"> </w:t>
+      </w:r>
+      <w:r>
+        <w:rPr>
+          <w:bCs/>
+          <w:b/>
+        </w:rPr>
+        <w:t xml:space="preserve">not</w:t>
+      </w:r>
+      <w:r>
+        <w:t xml:space="preserve"> </w:t>
+      </w:r>
+      <w:r>
+        <w:t xml:space="preserve">need the original files or the same USB stick.</w:t>
       </w:r>
     </w:p>
     <w:p>
@@ -24959,31 +25525,71 @@
         <w:pStyle w:val="Compact"/>
       </w:pPr>
       <w:r>
-        <w:t xml:space="preserve">Saves the entry to</w:t>
-      </w:r>
-      <w:r>
-        <w:t xml:space="preserve"> </w:t>
-      </w:r>
-      <w:r>
-        <w:rPr>
-          <w:rStyle w:val="VerbatimChar"/>
-        </w:rPr>
-        <w:t xml:space="preserve">localStorage</w:t>
-      </w:r>
-      <w:r>
-        <w:t xml:space="preserve"> </w:t>
-      </w:r>
-      <w:r>
-        <w:t xml:space="preserve">under the key</w:t>
-      </w:r>
-      <w:r>
-        <w:t xml:space="preserve"> </w:t>
-      </w:r>
-      <w:r>
-        <w:rPr>
-          <w:rStyle w:val="VerbatimChar"/>
-        </w:rPr>
-        <w:t xml:space="preserve">heratio_offline_queue_v1</w:t>
+        <w:t xml:space="preserve">Back in Heratio, on the</w:t>
+      </w:r>
+      <w:r>
+        <w:t xml:space="preserve"> </w:t>
+      </w:r>
+      <w:r>
+        <w:rPr>
+          <w:bCs/>
+          <w:b/>
+        </w:rPr>
+        <w:t xml:space="preserve">Work Offline</w:t>
+      </w:r>
+      <w:r>
+        <w:t xml:space="preserve"> </w:t>
+      </w:r>
+      <w:r>
+        <w:t xml:space="preserve">page, use</w:t>
+      </w:r>
+      <w:r>
+        <w:t xml:space="preserve"> </w:t>
+      </w:r>
+      <w:r>
+        <w:rPr>
+          <w:bCs/>
+          <w:b/>
+        </w:rPr>
+        <w:t xml:space="preserve">“</w:t>
+      </w:r>
+      <w:r>
+        <w:rPr>
+          <w:bCs/>
+          <w:b/>
+        </w:rPr>
+        <w:t xml:space="preserve">Bring your work back</w:t>
+      </w:r>
+      <w:r>
+        <w:rPr>
+          <w:bCs/>
+          <w:b/>
+        </w:rPr>
+        <w:t xml:space="preserve">”</w:t>
+      </w:r>
+      <w:r>
+        <w:t xml:space="preserve"> </w:t>
+      </w:r>
+      <w:r>
+        <w:t xml:space="preserve">and</w:t>
+      </w:r>
+      <w:r>
+        <w:t xml:space="preserve"> </w:t>
+      </w:r>
+      <w:r>
+        <w:t xml:space="preserve">upload that</w:t>
+      </w:r>
+      <w:r>
+        <w:t xml:space="preserve"> </w:t>
+      </w:r>
+      <w:r>
+        <w:rPr>
+          <w:rStyle w:val="VerbatimChar"/>
+        </w:rPr>
+        <w:t xml:space="preserve">researcher-sync.json</w:t>
+      </w:r>
+      <w:r>
+        <w:t xml:space="preserve">.</w:t>
       </w:r>
     </w:p>
     <w:p>
@@ -24995,82 +25601,19 @@
         <w:pStyle w:val="Compact"/>
       </w:pPr>
       <w:r>
-        <w:t xml:space="preserve">Shows a confirmation that the entry is queued</w:t>
-      </w:r>
-    </w:p>
-    <w:p>
-      <w:pPr>
-        <w:pStyle w:val="FirstParagraph"/>
-      </w:pPr>
-      <w:r>
-        <w:t xml:space="preserve">When your device reconnects, the queue is automatically POSTed to</w:t>
-      </w:r>
-      <w:r>
-        <w:t xml:space="preserve"> </w:t>
-      </w:r>
-      <w:r>
-        <w:rPr>
-          <w:rStyle w:val="VerbatimChar"/>
-        </w:rPr>
-        <w:t xml:space="preserve">/research/sync/offline</w:t>
-      </w:r>
-      <w:r>
-        <w:t xml:space="preserve"> </w:t>
-      </w:r>
-      <w:r>
-        <w:t xml:space="preserve">and applied as a real</w:t>
-      </w:r>
-      <w:r>
-        <w:t xml:space="preserve"> </w:t>
-      </w:r>
-      <w:r>
-        <w:rPr>
-          <w:rStyle w:val="VerbatimChar"/>
-        </w:rPr>
-        <w:t xml:space="preserve">research_journal_entry</w:t>
-      </w:r>
-      <w:r>
-        <w:t xml:space="preserve"> </w:t>
-      </w:r>
-      <w:r>
-        <w:t xml:space="preserve">row. The audit table</w:t>
-      </w:r>
-      <w:r>
-        <w:t xml:space="preserve"> </w:t>
-      </w:r>
-      <w:r>
-        <w:rPr>
-          <w:rStyle w:val="VerbatimChar"/>
-        </w:rPr>
-        <w:t xml:space="preserve">research_offline_sync_log</w:t>
-      </w:r>
-      <w:r>
-        <w:t xml:space="preserve"> </w:t>
-      </w:r>
-      <w:r>
-        <w:t xml:space="preserve">records the run.</w:t>
-      </w:r>
-    </w:p>
-    <w:bookmarkEnd w:id="266"/>
-    <w:bookmarkStart w:id="267" w:name="whats-supported-in-the-queue"/>
-    <w:p>
-      <w:pPr>
-        <w:pStyle w:val="Heading3"/>
-      </w:pPr>
-      <w:r>
-        <w:t xml:space="preserve">What’s supported in the queue</w:t>
+        <w:t xml:space="preserve">Heratio verifies it is yours and applies it:</w:t>
       </w:r>
     </w:p>
     <w:tbl>
       <w:tblPr>
         <w:tblStyle w:val="Table"/>
-        <w:tblW w:type="auto" w:w="0"/>
+        <w:tblW w:type="pct" w:w="5000"/>
         <w:tblLook w:firstRow="1" w:lastRow="0" w:firstColumn="0" w:lastColumn="0" w:noHBand="0" w:noVBand="0" w:val="0020"/>
         <w:jc w:val="start"/>
       </w:tblPr>
       <w:tblGrid>
-        <w:gridCol w:w="3960"/>
-        <w:gridCol w:w="3960"/>
+        <w:gridCol w:w="3168"/>
+        <w:gridCol w:w="4752"/>
       </w:tblGrid>
       <w:tr>
         <w:trPr>
@@ -25084,33 +25627,71 @@
               <w:jc w:val="left"/>
             </w:pPr>
             <w:r>
+              <w:t xml:space="preserve">Change</w:t>
+            </w:r>
+          </w:p>
+        </w:tc>
+        <w:tc>
+          <w:tcPr/>
+          <w:p>
+            <w:pPr>
+              <w:pStyle w:val="Compact"/>
+              <w:jc w:val="left"/>
+            </w:pPr>
+            <w:r>
+              <w:t xml:space="preserve">Applied to</w:t>
+            </w:r>
+          </w:p>
+        </w:tc>
+      </w:tr>
+      <w:tr>
+        <w:tc>
+          <w:tcPr/>
+          <w:p>
+            <w:pPr>
+              <w:pStyle w:val="Compact"/>
+              <w:jc w:val="left"/>
+            </w:pPr>
+            <w:r>
+              <w:t xml:space="preserve">Note</w:t>
+            </w:r>
+          </w:p>
+        </w:tc>
+        <w:tc>
+          <w:tcPr/>
+          <w:p>
+            <w:pPr>
+              <w:pStyle w:val="Compact"/>
+              <w:jc w:val="left"/>
+            </w:pPr>
+            <w:r>
               <w:rPr>
                 <w:rStyle w:val="VerbatimChar"/>
               </w:rPr>
-              <w:t xml:space="preserve">kind</w:t>
+              <w:t xml:space="preserve">research_annotation</w:t>
             </w:r>
             <w:r>
               <w:t xml:space="preserve"> </w:t>
             </w:r>
             <w:r>
-              <w:t xml:space="preserve">value</w:t>
-            </w:r>
-          </w:p>
-        </w:tc>
-        <w:tc>
-          <w:tcPr/>
-          <w:p>
-            <w:pPr>
-              <w:pStyle w:val="Compact"/>
-              <w:jc w:val="left"/>
-            </w:pPr>
-            <w:r>
-              <w:t xml:space="preserve">Applied to</w:t>
+              <w:t xml:space="preserve">(your note on the record)</w:t>
             </w:r>
           </w:p>
         </w:tc>
       </w:tr>
       <w:tr>
+        <w:tc>
+          <w:tcPr/>
+          <w:p>
+            <w:pPr>
+              <w:pStyle w:val="Compact"/>
+              <w:jc w:val="left"/>
+            </w:pPr>
+            <w:r>
+              <w:t xml:space="preserve">Source</w:t>
+            </w:r>
+          </w:p>
+        </w:tc>
         <w:tc>
           <w:tcPr/>
           <w:p>
@@ -25122,7 +25703,135 @@
               <w:rPr>
                 <w:rStyle w:val="VerbatimChar"/>
               </w:rPr>
-              <w:t xml:space="preserve">journal_entry</w:t>
+              <w:t xml:space="preserve">research_annotation</w:t>
+            </w:r>
+            <w:r>
+              <w:t xml:space="preserve"> </w:t>
+            </w:r>
+            <w:r>
+              <w:t xml:space="preserve">(type</w:t>
+            </w:r>
+            <w:r>
+              <w:t xml:space="preserve"> </w:t>
+            </w:r>
+            <w:r>
+              <w:rPr>
+                <w:iCs/>
+                <w:i/>
+              </w:rPr>
+              <w:t xml:space="preserve">source</w:t>
+            </w:r>
+            <w:r>
+              <w:t xml:space="preserve">)</w:t>
+            </w:r>
+          </w:p>
+        </w:tc>
+      </w:tr>
+      <w:tr>
+        <w:tc>
+          <w:tcPr/>
+          <w:p>
+            <w:pPr>
+              <w:pStyle w:val="Compact"/>
+              <w:jc w:val="left"/>
+            </w:pPr>
+            <w:r>
+              <w:t xml:space="preserve">Metadata suggestion</w:t>
+            </w:r>
+          </w:p>
+        </w:tc>
+        <w:tc>
+          <w:tcPr/>
+          <w:p>
+            <w:pPr>
+              <w:pStyle w:val="Compact"/>
+              <w:jc w:val="left"/>
+            </w:pPr>
+            <w:r>
+              <w:rPr>
+                <w:rStyle w:val="VerbatimChar"/>
+              </w:rPr>
+              <w:t xml:space="preserve">research_metadata_suggestion</w:t>
+            </w:r>
+            <w:r>
+              <w:t xml:space="preserve"> </w:t>
+            </w:r>
+            <w:r>
+              <w:t xml:space="preserve">— a</w:t>
+            </w:r>
+            <w:r>
+              <w:t xml:space="preserve"> </w:t>
+            </w:r>
+            <w:r>
+              <w:rPr>
+                <w:bCs/>
+                <w:b/>
+              </w:rPr>
+              <w:t xml:space="preserve">curator review queue</w:t>
+            </w:r>
+            <w:r>
+              <w:t xml:space="preserve">, never a live catalogue edit</w:t>
+            </w:r>
+          </w:p>
+        </w:tc>
+      </w:tr>
+      <w:tr>
+        <w:tc>
+          <w:tcPr/>
+          <w:p>
+            <w:pPr>
+              <w:pStyle w:val="Compact"/>
+              <w:jc w:val="left"/>
+            </w:pPr>
+            <w:r>
+              <w:t xml:space="preserve">File</w:t>
+            </w:r>
+          </w:p>
+        </w:tc>
+        <w:tc>
+          <w:tcPr/>
+          <w:p>
+            <w:pPr>
+              <w:pStyle w:val="Compact"/>
+              <w:jc w:val="left"/>
+            </w:pPr>
+            <w:r>
+              <w:rPr>
+                <w:rStyle w:val="VerbatimChar"/>
+              </w:rPr>
+              <w:t xml:space="preserve">research_offline_attachment</w:t>
+            </w:r>
+            <w:r>
+              <w:t xml:space="preserve"> </w:t>
+            </w:r>
+            <w:r>
+              <w:t xml:space="preserve">(saved under</w:t>
+            </w:r>
+            <w:r>
+              <w:t xml:space="preserve"> </w:t>
+            </w:r>
+            <w:r>
+              <w:rPr>
+                <w:rStyle w:val="VerbatimChar"/>
+              </w:rPr>
+              <w:t xml:space="preserve">uploads/research-offline/</w:t>
+            </w:r>
+            <w:r>
+              <w:t xml:space="preserve">)</w:t>
+            </w:r>
+          </w:p>
+        </w:tc>
+      </w:tr>
+      <w:tr>
+        <w:tc>
+          <w:tcPr/>
+          <w:p>
+            <w:pPr>
+              <w:pStyle w:val="Compact"/>
+              <w:jc w:val="left"/>
+            </w:pPr>
+            <w:r>
+              <w:t xml:space="preserve">Journal entry</w:t>
             </w:r>
           </w:p>
         </w:tc>
@@ -25142,47 +25851,41 @@
           </w:p>
         </w:tc>
       </w:tr>
-      <w:tr>
-        <w:tc>
-          <w:tcPr/>
-          <w:p>
-            <w:pPr>
-              <w:pStyle w:val="Compact"/>
-              <w:jc w:val="left"/>
-            </w:pPr>
-            <w:r>
-              <w:rPr>
-                <w:rStyle w:val="VerbatimChar"/>
-              </w:rPr>
-              <w:t xml:space="preserve">annotation</w:t>
-            </w:r>
-          </w:p>
-        </w:tc>
-        <w:tc>
-          <w:tcPr/>
-          <w:p>
-            <w:pPr>
-              <w:pStyle w:val="Compact"/>
-              <w:jc w:val="left"/>
-            </w:pPr>
-            <w:r>
-              <w:rPr>
-                <w:rStyle w:val="VerbatimChar"/>
-              </w:rPr>
-              <w:t xml:space="preserve">research_annotation</w:t>
-            </w:r>
-          </w:p>
-        </w:tc>
-      </w:tr>
     </w:tbl>
+    <w:p>
+      <w:pPr>
+        <w:pStyle w:val="BodyText"/>
+      </w:pPr>
+      <w:r>
+        <w:t xml:space="preserve">The run is recorded in</w:t>
+      </w:r>
+      <w:r>
+        <w:t xml:space="preserve"> </w:t>
+      </w:r>
+      <w:r>
+        <w:rPr>
+          <w:rStyle w:val="VerbatimChar"/>
+        </w:rPr>
+        <w:t xml:space="preserve">research_offline_sync_log</w:t>
+      </w:r>
+      <w:r>
+        <w:t xml:space="preserve">. If a change can’t be applied, the</w:t>
+      </w:r>
+      <w:r>
+        <w:t xml:space="preserve"> </w:t>
+      </w:r>
+      <w:r>
+        <w:t xml:space="preserve">page tells you why (e.g. an attachment folder that isn’t writable by the web server).</w:t>
+      </w:r>
+    </w:p>
     <w:bookmarkEnd w:id="267"/>
-    <w:bookmarkStart w:id="268" w:name="whats-not-supported"/>
+    <w:bookmarkStart w:id="268" w:name="curator-review-of-metadata-suggestions"/>
     <w:p>
       <w:pPr>
         <w:pStyle w:val="Heading3"/>
       </w:pPr>
       <w:r>
-        <w:t xml:space="preserve">What’s not supported</w:t>
+        <w:t xml:space="preserve">Curator review of metadata suggestions</w:t>
       </w:r>
     </w:p>
     <w:p>
@@ -25190,7 +25893,196 @@
         <w:pStyle w:val="FirstParagraph"/>
       </w:pPr>
       <w:r>
-        <w:t xml:space="preserve">Comments on projects, ORCID actions, file uploads, and bookings cannot be queued offline; they require an online connection. If you try to submit one while offline you’ll get a browser-level network error.</w:t>
+        <w:t xml:space="preserve">Suggestions never change the catalogue automatically. An administrator reviews them at</w:t>
+      </w:r>
+      <w:r>
+        <w:t xml:space="preserve"> </w:t>
+      </w:r>
+      <w:r>
+        <w:rPr>
+          <w:bCs/>
+          <w:b/>
+        </w:rPr>
+        <w:t xml:space="preserve">Research → Administration → Metadata Suggestions</w:t>
+      </w:r>
+      <w:r>
+        <w:t xml:space="preserve"> </w:t>
+      </w:r>
+      <w:r>
+        <w:t xml:space="preserve">(</w:t>
+      </w:r>
+      <w:r>
+        <w:rPr>
+          <w:rStyle w:val="VerbatimChar"/>
+        </w:rPr>
+        <w:t xml:space="preserve">/research/metadata-suggestions</w:t>
+      </w:r>
+      <w:r>
+        <w:t xml:space="preserve">),</w:t>
+      </w:r>
+      <w:r>
+        <w:t xml:space="preserve"> </w:t>
+      </w:r>
+      <w:r>
+        <w:t xml:space="preserve">with</w:t>
+      </w:r>
+      <w:r>
+        <w:t xml:space="preserve"> </w:t>
+      </w:r>
+      <w:r>
+        <w:rPr>
+          <w:bCs/>
+          <w:b/>
+        </w:rPr>
+        <w:t xml:space="preserve">Open / Accepted / Rejected</w:t>
+      </w:r>
+      <w:r>
+        <w:t xml:space="preserve"> </w:t>
+      </w:r>
+      <w:r>
+        <w:t xml:space="preserve">tabs and</w:t>
+      </w:r>
+      <w:r>
+        <w:t xml:space="preserve"> </w:t>
+      </w:r>
+      <w:r>
+        <w:rPr>
+          <w:bCs/>
+          <w:b/>
+        </w:rPr>
+        <w:t xml:space="preserve">Accept / Reject</w:t>
+      </w:r>
+      <w:r>
+        <w:t xml:space="preserve"> </w:t>
+      </w:r>
+      <w:r>
+        <w:t xml:space="preserve">actions (recording the</w:t>
+      </w:r>
+      <w:r>
+        <w:t xml:space="preserve"> </w:t>
+      </w:r>
+      <w:r>
+        <w:t xml:space="preserve">reviewer). An accepted suggestion is applied to the record by the curator manually.</w:t>
+      </w:r>
+    </w:p>
+    <w:bookmarkEnd w:id="268"/>
+    <w:bookmarkStart w:id="269" w:name="good-to-know"/>
+    <w:p>
+      <w:pPr>
+        <w:pStyle w:val="Heading3"/>
+      </w:pPr>
+      <w:r>
+        <w:t xml:space="preserve">Good to know</w:t>
+      </w:r>
+    </w:p>
+    <w:p>
+      <w:pPr>
+        <w:numPr>
+          <w:ilvl w:val="0"/>
+          <w:numId w:val="1037"/>
+        </w:numPr>
+        <w:pStyle w:val="Compact"/>
+      </w:pPr>
+      <w:r>
+        <w:rPr>
+          <w:bCs/>
+          <w:b/>
+        </w:rPr>
+        <w:t xml:space="preserve">Images:</w:t>
+      </w:r>
+      <w:r>
+        <w:t xml:space="preserve"> </w:t>
+      </w:r>
+      <w:r>
+        <w:t xml:space="preserve">the package includes</w:t>
+      </w:r>
+      <w:r>
+        <w:t xml:space="preserve"> </w:t>
+      </w:r>
+      <w:r>
+        <w:rPr>
+          <w:bCs/>
+          <w:b/>
+        </w:rPr>
+        <w:t xml:space="preserve">thumbnails</w:t>
+      </w:r>
+      <w:r>
+        <w:t xml:space="preserve"> </w:t>
+      </w:r>
+      <w:r>
+        <w:t xml:space="preserve">so records show offline; full-</w:t>
+      </w:r>
+      <w:r>
+        <w:t xml:space="preserve"> </w:t>
+      </w:r>
+      <w:r>
+        <w:t xml:space="preserve">resolution master files are not included (to keep packages small).</w:t>
+      </w:r>
+    </w:p>
+    <w:p>
+      <w:pPr>
+        <w:numPr>
+          <w:ilvl w:val="0"/>
+          <w:numId w:val="1037"/>
+        </w:numPr>
+        <w:pStyle w:val="Compact"/>
+      </w:pPr>
+      <w:r>
+        <w:rPr>
+          <w:bCs/>
+          <w:b/>
+        </w:rPr>
+        <w:t xml:space="preserve">Attachments</w:t>
+      </w:r>
+      <w:r>
+        <w:t xml:space="preserve"> </w:t>
+      </w:r>
+      <w:r>
+        <w:t xml:space="preserve">are carried inside the sync file (base64), capped at</w:t>
+      </w:r>
+      <w:r>
+        <w:t xml:space="preserve"> </w:t>
+      </w:r>
+      <w:r>
+        <w:rPr>
+          <w:bCs/>
+          <w:b/>
+        </w:rPr>
+        <w:t xml:space="preserve">5 MB</w:t>
+      </w:r>
+      <w:r>
+        <w:t xml:space="preserve"> </w:t>
+      </w:r>
+      <w:r>
+        <w:t xml:space="preserve">each.</w:t>
+      </w:r>
+    </w:p>
+    <w:p>
+      <w:pPr>
+        <w:numPr>
+          <w:ilvl w:val="0"/>
+          <w:numId w:val="1037"/>
+        </w:numPr>
+        <w:pStyle w:val="Compact"/>
+      </w:pPr>
+      <w:r>
+        <w:t xml:space="preserve">Work in</w:t>
+      </w:r>
+      <w:r>
+        <w:t xml:space="preserve"> </w:t>
+      </w:r>
+      <w:r>
+        <w:rPr>
+          <w:bCs/>
+          <w:b/>
+        </w:rPr>
+        <w:t xml:space="preserve">one browser</w:t>
+      </w:r>
+      <w:r>
+        <w:t xml:space="preserve"> </w:t>
+      </w:r>
+      <w:r>
+        <w:t xml:space="preserve">per package so all your changes end up in one sync file.</w:t>
       </w:r>
     </w:p>
     <w:p>
@@ -25212,9 +26104,9 @@
         <w:t xml:space="preserve">This manual covers ahgResearchPlugin v3.3.0. For the latest updates, check the plugin documentation in the AtoM Heratio repository.</w:t>
       </w:r>
     </w:p>
-    <w:bookmarkEnd w:id="268"/>
     <w:bookmarkEnd w:id="269"/>
     <w:bookmarkEnd w:id="270"/>
+    <w:bookmarkEnd w:id="271"/>
     <w:sectPr/>
   </w:body>
 </w:document>
@@ -26078,6 +26970,9 @@
     <w:lvlOverride w:ilvl="8">
       <w:startOverride w:val="1"/>
     </w:lvlOverride>
+  </w:num>
+  <w:num w:numId="1037">
+    <w:abstractNumId w:val="991"/>
   </w:num>
 </w:numbering>
 </file>

</xml_diff>

<commit_message>
v1.12.11: Researcher user guide: document Search & add records in the Work Offline section
</commit_message>
<xml_diff>
--- a/docs/researcher-user-guide.docx
+++ b/docs/researcher-user-guide.docx
@@ -25052,6 +25052,82 @@
         <w:pStyle w:val="FirstParagraph"/>
       </w:pPr>
       <w:r>
+        <w:t xml:space="preserve">You can also add</w:t>
+      </w:r>
+      <w:r>
+        <w:t xml:space="preserve"> </w:t>
+      </w:r>
+      <w:r>
+        <w:rPr>
+          <w:bCs/>
+          <w:b/>
+        </w:rPr>
+        <w:t xml:space="preserve">individual records</w:t>
+      </w:r>
+      <w:r>
+        <w:t xml:space="preserve"> </w:t>
+      </w:r>
+      <w:r>
+        <w:t xml:space="preserve">that aren’t in any of the above: under</w:t>
+      </w:r>
+      <w:r>
+        <w:t xml:space="preserve"> </w:t>
+      </w:r>
+      <w:r>
+        <w:rPr>
+          <w:bCs/>
+          <w:b/>
+        </w:rPr>
+        <w:t xml:space="preserve">Search &amp; add records</w:t>
+      </w:r>
+      <w:r>
+        <w:t xml:space="preserve">, type a title or identifier, then click a result to include</w:t>
+      </w:r>
+      <w:r>
+        <w:t xml:space="preserve"> </w:t>
+      </w:r>
+      <w:r>
+        <w:t xml:space="preserve">it (it appears under</w:t>
+      </w:r>
+      <w:r>
+        <w:t xml:space="preserve"> </w:t>
+      </w:r>
+      <w:r>
+        <w:rPr>
+          <w:iCs/>
+          <w:i/>
+        </w:rPr>
+        <w:t xml:space="preserve">“</w:t>
+      </w:r>
+      <w:r>
+        <w:rPr>
+          <w:iCs/>
+          <w:i/>
+        </w:rPr>
+        <w:t xml:space="preserve">Records added by search</w:t>
+      </w:r>
+      <w:r>
+        <w:rPr>
+          <w:iCs/>
+          <w:i/>
+        </w:rPr>
+        <w:t xml:space="preserve">”</w:t>
+      </w:r>
+      <w:r>
+        <w:t xml:space="preserve">). Only records you are permitted to</w:t>
+      </w:r>
+      <w:r>
+        <w:t xml:space="preserve"> </w:t>
+      </w:r>
+      <w:r>
+        <w:t xml:space="preserve">see appear in the results.</w:t>
+      </w:r>
+    </w:p>
+    <w:p>
+      <w:pPr>
+        <w:pStyle w:val="BodyText"/>
+      </w:pPr>
+      <w:r>
         <w:t xml:space="preserve">Click</w:t>
       </w:r>
       <w:r>
@@ -25092,7 +25168,10 @@
         <w:t xml:space="preserve">README.txt</w:t>
       </w:r>
       <w:r>
-        <w:t xml:space="preserve">.</w:t>
+        <w:t xml:space="preserve"> </w:t>
+      </w:r>
+      <w:r>
+        <w:t xml:space="preserve">with instructions.</w:t>
       </w:r>
     </w:p>
     <w:p>

</xml_diff>